<commit_message>
Finishing and Cleaning Tasks 9/04/2026 -W8 visualiser code
</commit_message>
<xml_diff>
--- a/W8/W8_lab_report.docx
+++ b/W8/W8_lab_report.docx
@@ -777,6 +777,217 @@
                     <a:xfrm>
                       <a:off x="0" y="0"/>
                       <a:ext cx="2283789" cy="2766024"/>
+                    </a:xfrm>
+                    <a:prstGeom prst="rect">
+                      <a:avLst/>
+                    </a:prstGeom>
+                  </pic:spPr>
+                </pic:pic>
+              </a:graphicData>
+            </a:graphic>
+          </wp:inline>
+        </w:drawing>
+      </w:r>
+    </w:p>
+    <w:p>
+      <w:pPr>
+        <w:pStyle w:val="ListParagraph"/>
+        <w:numPr>
+          <w:ilvl w:val="0"/>
+          <w:numId w:val="1"/>
+        </w:numPr>
+        <w:rPr>
+          <w:lang w:val="en-US"/>
+        </w:rPr>
+      </w:pPr>
+      <w:r>
+        <w:rPr>
+          <w:lang w:val="en-US"/>
+        </w:rPr>
+        <w:t>Removing Verts</w:t>
+      </w:r>
+    </w:p>
+    <w:p>
+      <w:pPr>
+        <w:pStyle w:val="ListParagraph"/>
+        <w:numPr>
+          <w:ilvl w:val="1"/>
+          <w:numId w:val="1"/>
+        </w:numPr>
+        <w:rPr>
+          <w:lang w:val="en-US"/>
+        </w:rPr>
+      </w:pPr>
+      <w:r>
+        <w:rPr>
+          <w:lang w:val="en-US"/>
+        </w:rPr>
+        <w:drawing>
+          <wp:inline distT="0" distB="0" distL="0" distR="0" wp14:anchorId="03865472" wp14:editId="7DE74F1F">
+            <wp:extent cx="2522862" cy="3070860"/>
+            <wp:effectExtent l="0" t="0" r="0" b="0"/>
+            <wp:docPr id="320558846" name="Picture 1"/>
+            <wp:cNvGraphicFramePr>
+              <a:graphicFrameLocks xmlns:a="http://schemas.openxmlformats.org/drawingml/2006/main" noChangeAspect="1"/>
+            </wp:cNvGraphicFramePr>
+            <a:graphic xmlns:a="http://schemas.openxmlformats.org/drawingml/2006/main">
+              <a:graphicData uri="http://schemas.openxmlformats.org/drawingml/2006/picture">
+                <pic:pic xmlns:pic="http://schemas.openxmlformats.org/drawingml/2006/picture">
+                  <pic:nvPicPr>
+                    <pic:cNvPr id="320558846" name=""/>
+                    <pic:cNvPicPr/>
+                  </pic:nvPicPr>
+                  <pic:blipFill>
+                    <a:blip r:embed="rId14"/>
+                    <a:stretch>
+                      <a:fillRect/>
+                    </a:stretch>
+                  </pic:blipFill>
+                  <pic:spPr>
+                    <a:xfrm>
+                      <a:off x="0" y="0"/>
+                      <a:ext cx="2533614" cy="3083948"/>
+                    </a:xfrm>
+                    <a:prstGeom prst="rect">
+                      <a:avLst/>
+                    </a:prstGeom>
+                  </pic:spPr>
+                </pic:pic>
+              </a:graphicData>
+            </a:graphic>
+          </wp:inline>
+        </w:drawing>
+      </w:r>
+    </w:p>
+    <w:p>
+      <w:pPr>
+        <w:pStyle w:val="ListParagraph"/>
+        <w:numPr>
+          <w:ilvl w:val="0"/>
+          <w:numId w:val="1"/>
+        </w:numPr>
+        <w:rPr>
+          <w:lang w:val="en-US"/>
+        </w:rPr>
+      </w:pPr>
+      <w:r>
+        <w:rPr>
+          <w:lang w:val="en-US"/>
+        </w:rPr>
+        <w:t>Adding edge</w:t>
+      </w:r>
+    </w:p>
+    <w:p>
+      <w:pPr>
+        <w:pStyle w:val="ListParagraph"/>
+        <w:numPr>
+          <w:ilvl w:val="1"/>
+          <w:numId w:val="1"/>
+        </w:numPr>
+        <w:rPr>
+          <w:lang w:val="en-US"/>
+        </w:rPr>
+      </w:pPr>
+      <w:r>
+        <w:rPr>
+          <w:lang w:val="en-US"/>
+        </w:rPr>
+        <w:lastRenderedPageBreak/>
+        <w:drawing>
+          <wp:inline distT="0" distB="0" distL="0" distR="0" wp14:anchorId="4EEC1FB4" wp14:editId="099E5E27">
+            <wp:extent cx="3307080" cy="4052794"/>
+            <wp:effectExtent l="0" t="0" r="7620" b="5080"/>
+            <wp:docPr id="526883487" name="Picture 1"/>
+            <wp:cNvGraphicFramePr>
+              <a:graphicFrameLocks xmlns:a="http://schemas.openxmlformats.org/drawingml/2006/main" noChangeAspect="1"/>
+            </wp:cNvGraphicFramePr>
+            <a:graphic xmlns:a="http://schemas.openxmlformats.org/drawingml/2006/main">
+              <a:graphicData uri="http://schemas.openxmlformats.org/drawingml/2006/picture">
+                <pic:pic xmlns:pic="http://schemas.openxmlformats.org/drawingml/2006/picture">
+                  <pic:nvPicPr>
+                    <pic:cNvPr id="526883487" name=""/>
+                    <pic:cNvPicPr/>
+                  </pic:nvPicPr>
+                  <pic:blipFill>
+                    <a:blip r:embed="rId15"/>
+                    <a:stretch>
+                      <a:fillRect/>
+                    </a:stretch>
+                  </pic:blipFill>
+                  <pic:spPr>
+                    <a:xfrm>
+                      <a:off x="0" y="0"/>
+                      <a:ext cx="3313194" cy="4060286"/>
+                    </a:xfrm>
+                    <a:prstGeom prst="rect">
+                      <a:avLst/>
+                    </a:prstGeom>
+                  </pic:spPr>
+                </pic:pic>
+              </a:graphicData>
+            </a:graphic>
+          </wp:inline>
+        </w:drawing>
+      </w:r>
+    </w:p>
+    <w:p>
+      <w:pPr>
+        <w:pStyle w:val="ListParagraph"/>
+        <w:numPr>
+          <w:ilvl w:val="0"/>
+          <w:numId w:val="1"/>
+        </w:numPr>
+        <w:rPr>
+          <w:lang w:val="en-US"/>
+        </w:rPr>
+      </w:pPr>
+      <w:r>
+        <w:rPr>
+          <w:lang w:val="en-US"/>
+        </w:rPr>
+        <w:t>Removing edge</w:t>
+      </w:r>
+    </w:p>
+    <w:p>
+      <w:pPr>
+        <w:pStyle w:val="ListParagraph"/>
+        <w:numPr>
+          <w:ilvl w:val="1"/>
+          <w:numId w:val="1"/>
+        </w:numPr>
+        <w:rPr>
+          <w:lang w:val="en-US"/>
+        </w:rPr>
+      </w:pPr>
+      <w:r>
+        <w:rPr>
+          <w:lang w:val="en-US"/>
+        </w:rPr>
+        <w:drawing>
+          <wp:inline distT="0" distB="0" distL="0" distR="0" wp14:anchorId="09159EB0" wp14:editId="302DA32D">
+            <wp:extent cx="3223777" cy="3957645"/>
+            <wp:effectExtent l="0" t="0" r="0" b="5080"/>
+            <wp:docPr id="1821095535" name="Picture 1"/>
+            <wp:cNvGraphicFramePr>
+              <a:graphicFrameLocks xmlns:a="http://schemas.openxmlformats.org/drawingml/2006/main" noChangeAspect="1"/>
+            </wp:cNvGraphicFramePr>
+            <a:graphic xmlns:a="http://schemas.openxmlformats.org/drawingml/2006/main">
+              <a:graphicData uri="http://schemas.openxmlformats.org/drawingml/2006/picture">
+                <pic:pic xmlns:pic="http://schemas.openxmlformats.org/drawingml/2006/picture">
+                  <pic:nvPicPr>
+                    <pic:cNvPr id="1821095535" name=""/>
+                    <pic:cNvPicPr/>
+                  </pic:nvPicPr>
+                  <pic:blipFill>
+                    <a:blip r:embed="rId16"/>
+                    <a:stretch>
+                      <a:fillRect/>
+                    </a:stretch>
+                  </pic:blipFill>
+                  <pic:spPr>
+                    <a:xfrm>
+                      <a:off x="0" y="0"/>
+                      <a:ext cx="3233655" cy="3969771"/>
                     </a:xfrm>
                     <a:prstGeom prst="rect">
                       <a:avLst/>

</xml_diff>